<commit_message>
feature(txtectractor): add extractor for .txt files
</commit_message>
<xml_diff>
--- a/DocumentTest/textToTest.docx
+++ b/DocumentTest/textToTest.docx
@@ -22,15 +22,28 @@
         </w:rPr>
         <w:t xml:space="preserve"> Eleanor Vance </w:t>
       </w:r>
-      <w:hyperlink r:id="rId4" w:tgtFrame="_blank" w:history="1">
-        <w:r>
-          <w:rPr>
-            <w:rStyle w:val="Hyperlink"/>
-            <w:lang w:val="en-US"/>
-          </w:rPr>
-          <w:t>e.vance1988@example-mail.com</w:t>
-        </w:r>
-      </w:hyperlink>
+      <w:r>
+        <w:fldChar w:fldCharType="begin"/>
+      </w:r>
+      <w:r>
+        <w:rPr>
+          <w:lang w:val="en-US"/>
+        </w:rPr>
+        <w:instrText>HYPERLINK "mailto:e.vance1988@example-mail.com" \t "_blank"</w:instrText>
+      </w:r>
+      <w:r>
+        <w:fldChar w:fldCharType="separate"/>
+      </w:r>
+      <w:r>
+        <w:rPr>
+          <w:rStyle w:val="Hyperlink"/>
+          <w:lang w:val="en-US"/>
+        </w:rPr>
+        <w:t>e.vance1988@example-mail.com</w:t>
+      </w:r>
+      <w:r>
+        <w:fldChar w:fldCharType="end"/>
+      </w:r>
     </w:p>
     <w:p>
       <w:pPr>
@@ -235,7 +248,6 @@
         <w:t>Eleanor Vance</w:t>
       </w:r>
     </w:p>
-    <w:p/>
     <w:sectPr>
       <w:pgSz w:w="11906" w:h="16838"/>
       <w:pgMar w:top="1701" w:right="1134" w:bottom="1701" w:left="1134" w:header="708" w:footer="708" w:gutter="0"/>
@@ -850,6 +862,7 @@
   <w:style w:type="character" w:default="1" w:styleId="Standardskrifttypeiafsnit">
     <w:name w:val="Default Paragraph Font"/>
     <w:uiPriority w:val="1"/>
+    <w:semiHidden/>
     <w:unhideWhenUsed/>
   </w:style>
   <w:style w:type="table" w:default="1" w:styleId="Tabel-Normal">

</xml_diff>